<commit_message>
Finalize CISC3024 Assignment 2 submission
</commit_message>
<xml_diff>
--- a/report/CISC3024_AI_Assignment2_Final.docx
+++ b/report/CISC3024_AI_Assignment2_Final.docx
@@ -9,9 +9,9 @@
         <w:jc w:val="center"/>
       </w:pPr>
       <w:r>
-        <w:t>AI Assisted Implementation and Evaluation of</w:t>
+        <w:t>Density-Aware Evidential Deep Learning for CIFAR-10</w:t>
         <w:br/>
-        <w:t>Density Aware Evidential Deep Learning</w:t>
+        <w:t>Classification and Uncertainty Estimation</w:t>
       </w:r>
     </w:p>
     <w:p>
@@ -31,24 +31,20 @@
     </w:p>
     <w:p>
       <w:pPr>
-        <w:spacing w:before="440"/>
+        <w:spacing w:before="360"/>
+        <w:jc w:val="center"/>
+      </w:pPr>
+      <w:r>
+        <w:t>Ziqi Huang</w:t>
+      </w:r>
+    </w:p>
+    <w:p>
+      <w:pPr>
+        <w:spacing w:before="160"/>
         <w:jc w:val="center"/>
       </w:pPr>
       <w:r>
         <w:t>October 2026</w:t>
-      </w:r>
-    </w:p>
-    <w:p>
-      <w:pPr>
-        <w:spacing w:before="2600"/>
-        <w:jc w:val="center"/>
-      </w:pPr>
-      <w:r>
-        <w:rPr>
-          <w:color w:val="505050"/>
-          <w:sz w:val="19"/>
-        </w:rPr>
-        <w:t>Prepared through an AI-assisted workflow with Codex</w:t>
       </w:r>
     </w:p>
     <w:p>
@@ -76,7 +72,7 @@
     </w:p>
     <w:p>
       <w:r>
-        <w:t>The three-seed results show a limited trade-off rather than an overall DAEDL advantage. Softmax achieved higher accuracy (0.9013 ± 0.0004 versus 0.8902 ± 0.0012) and better NLL and Brier score. DAEDL achieved lower ECE in every seed (0.0261 ± 0.0030 versus 0.0463 ± 0.0031). Both methods assigned greater entropy to mistakes, while Softmax had a small error-AUROC advantage. SVHN OOD rankings changed by seed, so the experiment did not establish a stable OOD winner.</w:t>
+        <w:t>The three-seed results show different strengths across the evaluation metrics. Softmax achieved higher accuracy (0.9013 ± 0.0004 versus 0.8902 ± 0.0012) and better NLL and Brier score. DAEDL achieved lower ECE in every seed (0.0261 ± 0.0030 versus 0.0463 ± 0.0031). Both methods assigned greater entropy to mistakes, and Softmax had a small error-AUROC advantage. The SVHN OOD ranking changed across seeds, so neither method was consistently better.</w:t>
       </w:r>
     </w:p>
     <w:p>
@@ -84,22 +80,22 @@
         <w:pStyle w:val="Heading1"/>
       </w:pPr>
       <w:r>
-        <w:t>2 AI Assisted Algorithm Search and Selection</w:t>
+        <w:t>2 AI-Assisted Algorithm Search and Selection</w:t>
       </w:r>
     </w:p>
     <w:p>
       <w:r>
-        <w:t>Codex was asked to find a recent classification or recognition algorithm grounded in probability or Bayesian theory. It filtered candidates using publication date, relevance to computer-vision classification, access to a primary paper and implementation, computational feasibility on a laptop, and whether the method supported a clear comparison with a conventional baseline.</w:t>
+        <w:t>Codex searched for recent classification and recognition methods grounded in probability or Bayesian theory. Codex first compared DAEDL with conventional evidential deep learning. The candidates were screened by publication date, probabilistic basis, implementation availability, computational cost, and suitability for a CIFAR-10 comparison.</w:t>
       </w:r>
     </w:p>
     <w:p>
       <w:r>
-        <w:t>DAEDL met these criteria because it predicts a Dirichlet distribution, models density in learned feature space, and reports classification, calibration, error detection, and OOD experiments [1]. It was recent, directly relevant to image recognition, and small enough to adapt into a controlled CIFAR-10 study.</w:t>
+        <w:t>DAEDL was selected because it predicts a Dirichlet distribution, models density in learned feature space, and supports classification, calibration, error-detection, and OOD evaluation [1]. It was recent, directly relevant to image recognition, and small enough to adapt into a controlled CIFAR-10 study.</w:t>
       </w:r>
     </w:p>
     <w:p>
       <w:r>
-        <w:t>Codex checked the official PMLR record, the paper, and the authors' repository. It did not treat the repository as a ready-made solution: the audit found CUDA assumptions, incomplete environment information, missing released checkpoints, and reproducibility gaps. A clean implementation was therefore used, with the official code serving as a method reference [7]. Conventional evidential deep learning [2] and calibration work [3] supplied the background needed to interpret the method and metrics.</w:t>
+        <w:t>The search then checked the official PMLR record, the paper, and the authors' repository. Codex used the repository as a method reference and created a separate implementation adapted to this assignment [7]. The repository audit found CUDA assumptions, incomplete environment information, missing released checkpoints, and reproducibility gaps. Conventional evidential deep learning [2] and calibration work [3] supplied the background needed to interpret the method and metrics.</w:t>
       </w:r>
     </w:p>
     <w:p>
@@ -165,7 +161,7 @@
     </w:p>
     <w:p>
       <w:r>
-        <w:t>The second expression above is the evidential counterpart. A Dirichlet random variable π represents uncertainty over categorical probability vectors, and its mean gives the predictive class probability. The total concentration S controls how tightly the Dirichlet mass is concentrated.</w:t>
+        <w:t>The second expression above is the evidential counterpart. A Dirichlet random variable π represents uncertainty over categorical probability vectors, and its mean gives the predictive class probability. A larger total concentration S places more mass around that mean probability vector; a smaller value represents weaker evidence.</w:t>
       </w:r>
     </w:p>
     <w:p>
@@ -281,7 +277,7 @@
     </w:p>
     <w:p>
       <w:r>
-        <w:t>A test embedding near the fitted training features receives a larger density score. A distant embedding receives a smaller score. Because full covariance and log-density calculations are sensitive to numerical precision, the implementation performs this stage on CPU in float64 and adds scale-relative diagonal jitter when Cholesky factorization requires it.</w:t>
+        <w:t>A test embedding near the fitted training features receives a larger density score. An embedding far from the fitted distribution receives a smaller score and therefore weaker evidence at prediction time. Because full covariance and log-density calculations are sensitive to numerical precision, the implementation performs this stage on CPU in float64 and adds scale-relative diagonal jitter when Cholesky factorization requires it.</w:t>
       </w:r>
     </w:p>
     <w:p>
@@ -339,7 +335,7 @@
     </w:p>
     <w:p>
       <w:r>
-        <w:t>This project used normalized predictive entropy as the primary common uncertainty score. The normalization places entropy in [0,1] for both methods, so the same error-detection and OOD metric code can be used.</w:t>
+        <w:t>This project used normalized predictive entropy to compare uncertainty across the two methods. The normalization places entropy in [0,1], so the same error-detection and OOD metric code can be used.</w:t>
       </w:r>
     </w:p>
     <w:p>
@@ -443,27 +439,110 @@
         <w:pStyle w:val="Heading1"/>
       </w:pPr>
       <w:r>
-        <w:t>4 AI Assisted Implementation</w:t>
+        <w:t>4 AI-Assisted Implementation</w:t>
+      </w:r>
+    </w:p>
+    <w:p>
+      <w:pPr>
+        <w:pStyle w:val="Heading2"/>
+      </w:pPr>
+      <w:r>
+        <w:t>4.1 Project and environment setup</w:t>
       </w:r>
     </w:p>
     <w:p>
       <w:r>
-        <w:t>Codex inspected the paper and official code, created an isolated Python 3.11 environment, and implemented the complete project. The code includes fixed stratified splits, indexed datasets, train-only augmentation, a CIFAR-adapted ResNet-18, Softmax cross-entropy, the DAEDL objective, CPU GDA, evaluation metrics, artifact logging, and plotting. Automated tests cover probability normalization, DAEDL gradients, calibration metrics, score direction, GDA fitting, split reproducibility, and model output shapes.</w:t>
+        <w:t>Codex created an isolated Python 3.11.5 environment with PyTorch 2.14.1 and torchvision 0.29.1 on an Apple M5 MacBook Air with 16 GB unified memory. The implementation covers data loading, model construction, Softmax and DAEDL training, density fitting, evaluation, artifact logging, and report figures.</w:t>
       </w:r>
     </w:p>
     <w:p>
       <w:r>
-        <w:t>The pilot exposed a PyTorch MPS issue: reloaded spectral-normalized models could produce non-finite outputs during the observed post-training evaluation path, although CPU evaluation of the same checkpoint was finite. Final training therefore used MPS, while checkpoint evaluation and feature extraction used CPU. PyTorch documents that MPS cannot store float64 tensors, which independently requires the GDA stage to run on CPU [6].</w:t>
+        <w:t>Neural-network training used MPS. Selected checkpoints were evaluated on CPU, and DAEDL density estimation used CPU float64 because the MPS backend cannot store float64 tensors [6]. The pilot also found that a reloaded spectral-normalized checkpoint could produce non-finite outputs on the observed MPS evaluation path while the same weights were finite on CPU. The final protocol used the same CPU checkpoint-evaluation policy for both models.</w:t>
+      </w:r>
+    </w:p>
+    <w:p>
+      <w:pPr>
+        <w:pStyle w:val="Heading2"/>
+      </w:pPr>
+      <w:r>
+        <w:t>4.2 Data pipeline</w:t>
       </w:r>
     </w:p>
     <w:p>
       <w:r>
-        <w:t>Full-covariance matrices were rank deficient because some ReLU embedding coordinates were constant. The implementation used scale-relative diagonal loading and recorded global rank, per-class rank, jitter, training density range, and non-finite fraction. It did not change the architecture after seeing seed-3024 results. A training-only sensitivity check on that seed showed that removing globally constant dimensions did not materially change the primary outputs.</w:t>
+        <w:t>Each CIFAR-10 example retained its original sample index so that splits and predictions could be audited. The 50,000 official training images were divided into a stratified 45,000-image training set and 5,000-image validation set. Training used random 32-by-32 crops with four-pixel padding, random horizontal flips, tensor conversion, and channel normalization with mean (0.4914, 0.4822, 0.4465) and standard deviation (0.2023, 0.1994, 0.2010). Validation, test, and density fitting used only tensor conversion and the same normalization.</w:t>
       </w:r>
     </w:p>
     <w:p>
       <w:r>
-        <w:t>For experimental validity, Codex applied identical splits to both models within each seed, selected checkpoints by minimum validation NLL, saved both selected and final checkpoints, kept the test set out of model selection, and defined OOD as the positive class. Every final probability row, checkpoint label, metric, and density diagnostic was checked. The six-run audit and all 16 automated tests passed.</w:t>
+        <w:t>The code saved the train, validation, and test indices for every run. Python, NumPy, PyTorch, and the data-loader generator were seeded. Within a seed, Softmax and DAEDL used identical indices; across seeds, the split and training randomness changed according to the recorded seed.</w:t>
+      </w:r>
+    </w:p>
+    <w:p>
+      <w:pPr>
+        <w:pStyle w:val="Heading2"/>
+      </w:pPr>
+      <w:r>
+        <w:t>4.3 Model implementation</w:t>
+      </w:r>
+    </w:p>
+    <w:p>
+      <w:r>
+        <w:t>Both methods used the same CIFAR-adapted ResNet-18. It has a 3-by-3 stride-one stem, base width 32, four residual stages, adaptive average pooling, a 128-dimensional ReLU embedding, and a ten-class linear classifier. The forward method exposes both logits and embeddings because DAEDL needs the embeddings after training.</w:t>
+      </w:r>
+    </w:p>
+    <w:p>
+      <w:r>
+        <w:t>Spectral normalization was applied to every convolution, learned shortcut projection, the embedding layer, and the classifier for both models. Sharing the feature extractor, data pipeline, and training budget keeps the comparison focused on the prediction and uncertainty mechanisms. Softmax uses cross-entropy. DAEDL uses its evidential objective, followed by feature-density fitting and density-aware inference.</w:t>
+      </w:r>
+    </w:p>
+    <w:p>
+      <w:pPr>
+        <w:pStyle w:val="Heading2"/>
+      </w:pPr>
+      <w:r>
+        <w:t>4.4 DAEDL density estimation</w:t>
+      </w:r>
+    </w:p>
+    <w:p>
+      <w:r>
+        <w:t>Density estimation begins after neural-network training. The selected checkpoint is loaded on CPU, and clean embeddings are extracted from all 45,000 training images. The implementation fits one full-covariance Gaussian per class and uses empirical class proportions as mixture weights. The minimum and maximum training log densities define the clipped score s(x) used at inference.</w:t>
+      </w:r>
+    </w:p>
+    <w:p>
+      <w:r>
+        <w:t>All covariance calculations use CPU float64. Each covariance is symmetrized, and scale-relative diagonal jitter with an absolute floor of 1e-8 is increased until Cholesky factorization succeeds. The run artifacts record global and per-class ranks, constant dimensions, jitter, the training density range, and non-finite fractions. The fitted GDA state and per-example training density values are also saved.</w:t>
+      </w:r>
+    </w:p>
+    <w:p>
+      <w:pPr>
+        <w:pStyle w:val="Heading2"/>
+      </w:pPr>
+      <w:r>
+        <w:t>4.5 Staged implementation workflow</w:t>
+      </w:r>
+    </w:p>
+    <w:p>
+      <w:r>
+        <w:t>The implementation was validated in stages. A two-epoch pilot used 5,000 training, 1,000 validation, and 1,000 test images to check finite losses and gradients, checkpoint reloads, GDA fitting, metrics, and artifact output. The first full experiment then trained both models on seed 3024 and evaluated classification, calibration, prediction errors, SVHN OOD detection, and density diagnostics. After those checks passed, the same configuration was then used for seeds 3025 and 3026.</w:t>
+      </w:r>
+    </w:p>
+    <w:p>
+      <w:pPr>
+        <w:pStyle w:val="Heading2"/>
+      </w:pPr>
+      <w:r>
+        <w:t>4.6 Validation testing and reproducibility</w:t>
+      </w:r>
+    </w:p>
+    <w:p>
+      <w:r>
+        <w:t>The 16 automated tests cover four groups. Probability and loss tests check positive concentrations, normalized probabilities, and finite DAEDL losses and gradients. Metric tests check NLL, Brier score, ECE, entropy, and AUROC/AUPR direction. Density tests cover shapes, CPU float64 state, rank-deficient covariance handling, and finite scores. Reproducibility tests cover stratified disjoint splits, exposed model outputs, and spectral-normalization coverage.</w:t>
+      </w:r>
+    </w:p>
+    <w:p>
+      <w:r>
+        <w:t>Every final run saved its configuration, environment, split indices, progress log, training history, best-validation and final checkpoints, per-example CIFAR-10 and SVHN predictions, metrics, runtime, and DAEDL density diagnostics where applicable. Aggregate tables were recomputed from the saved predictions. The six-run audit verified matched within-seed splits, checkpoint selection, probability normalization, finite outputs, positive DAEDL concentrations, score direction, density stability, and sample-SD aggregation.</w:t>
       </w:r>
     </w:p>
     <w:p>
@@ -475,8 +554,47 @@
       </w:r>
     </w:p>
     <w:p>
+      <w:pPr>
+        <w:pStyle w:val="Heading2"/>
+      </w:pPr>
       <w:r>
-        <w:t>CIFAR-10 provided 45,000 training images, 5,000 validation images, and the untouched official 10,000-image test set [4]. SVHN supplied 10,000 deterministically selected OOD test images [5]. Both models used the same backbone, spectral normalization, augmentation, optimizer, schedule, epoch budget, and checkpoint rule. Seeds 3024, 3025, and 3026 controlled the stratified split and training randomness. The replicate unit is a training seed and model run; results are mean ± sample SD across three seeds.</w:t>
+        <w:t>5.1 Datasets and split</w:t>
+      </w:r>
+    </w:p>
+    <w:p>
+      <w:r>
+        <w:t>CIFAR-10 contains ten natural-object classes with 50,000 official training images and 10,000 official test images [4]. The training portion was divided into a stratified 45,000-image training set and 5,000-image validation set. Validation NLL selected checkpoints, while the official test set remained outside model selection.</w:t>
+      </w:r>
+    </w:p>
+    <w:p>
+      <w:r>
+        <w:t>SVHN supplied 10,000 deterministically selected test images for OOD evaluation [5]. CIFAR-10 contains natural objects; SVHN contains street-view house-number digits. Their visual domains and semantic classes differ, making SVHN a useful OOD dataset for this controlled comparison without implying that it is the only possible benchmark.</w:t>
+      </w:r>
+    </w:p>
+    <w:p>
+      <w:pPr>
+        <w:pStyle w:val="Heading2"/>
+      </w:pPr>
+      <w:r>
+        <w:t>5.2 Fair comparison design</w:t>
+      </w:r>
+    </w:p>
+    <w:p>
+      <w:r>
+        <w:t>Softmax and DAEDL shared the same backbone, spectral-normalization configuration, split, training augmentation, batch size, optimizer, epoch budget, learning-rate schedule, and checkpoint criterion within each seed. These controls reduce differences caused by the feature extractor or training resources. DAEDL necessarily differs in its evidential objective, post-training density model, and density-aware inference.</w:t>
+      </w:r>
+    </w:p>
+    <w:p>
+      <w:pPr>
+        <w:pStyle w:val="Heading2"/>
+      </w:pPr>
+      <w:r>
+        <w:t>5.3 Training protocol</w:t>
+      </w:r>
+    </w:p>
+    <w:p>
+      <w:r>
+        <w:t>Each run trained for 30 epochs with batch size 64, AdamW, an initial learning rate of 1e-3, weight decay 5e-4, and cosine decay to 1e-5. Both models selected the checkpoint with minimum validation NLL. This provides a common probability-based criterion even though their training objectives differ. The best-validation checkpoint and the final-epoch checkpoint were both saved, and the test set was never used for selection.</w:t>
       </w:r>
     </w:p>
     <w:p>
@@ -492,7 +610,7 @@
         <w:t xml:space="preserve">Table 1. </w:t>
       </w:r>
       <w:r>
-        <w:t>Frozen experimental configuration.</w:t>
+        <w:t>Experimental configuration.</w:t>
       </w:r>
     </w:p>
     <w:tbl>
@@ -1361,10 +1479,613 @@
       </w:tr>
     </w:tbl>
     <w:p>
+      <w:pPr>
+        <w:pStyle w:val="Heading2"/>
+      </w:pPr>
       <w:r>
-        <w:t>Classification uses accuracy and Macro F1. Calibration uses negative log-likelihood (NLL), 15-bin expected calibration error (ECE), and multiclass Brier score. Error detection and OOD detection use normalized predictive entropy with AUROC and average precision (AUPR). Lower values are preferable for NLL, ECE, and Brier; higher values are preferable for accuracy, F1, AUROC, and AUPR.</w:t>
+        <w:t>5.4 Three-seed replication</w:t>
       </w:r>
     </w:p>
+    <w:p>
+      <w:r>
+        <w:t>Seeds 3024, 3025, and 3026 each defined a complete model run. The seed controlled the stratified train-validation split, Python and NumPy random states, PyTorch initialization and training randomness, and the data-loader generator. Softmax and DAEDL shared indices within each seed. Results are reported as mean ± sample SD across the three runs, not across individual images. Three seeds were used to check whether the comparison remained consistent under different data splits and training randomness.</w:t>
+      </w:r>
+    </w:p>
+    <w:p>
+      <w:pPr>
+        <w:pStyle w:val="Heading2"/>
+      </w:pPr>
+      <w:r>
+        <w:t>5.5 Classification evaluation</w:t>
+      </w:r>
+    </w:p>
+    <w:p>
+      <w:r>
+        <w:t>Accuracy is the fraction of correct CIFAR-10 predictions. Macro F1 averages class-level F1 scores with equal weight for each class. CIFAR-10 is balanced, but Macro F1 still checks whether performance is distributed across classes instead of relying only on total accuracy.</w:t>
+      </w:r>
+    </w:p>
+    <w:p>
+      <w:pPr>
+        <w:pStyle w:val="Heading2"/>
+      </w:pPr>
+      <w:r>
+        <w:t>5.6 Calibration evaluation</w:t>
+      </w:r>
+    </w:p>
+    <w:p>
+      <w:r>
+        <w:t>Negative log-likelihood uses the probability assigned to the true class and gives a large penalty to confident mistakes. ECE divides predictions into 15 equal-width confidence bins and computes the count-weighted difference between mean confidence and observed accuracy in each bin. The multiclass Brier score is the mean squared difference between the predicted probability vector and the one-hot target. Using all three metrics gives a broader view of probability quality than relying on a single calibration measure.</w:t>
+      </w:r>
+    </w:p>
+    <w:p>
+      <w:pPr>
+        <w:pStyle w:val="Heading2"/>
+      </w:pPr>
+      <w:r>
+        <w:t>5.7 Prediction-error uncertainty</w:t>
+      </w:r>
+    </w:p>
+    <w:p>
+      <w:r>
+        <w:t>This experiment asks whether uncertainty can identify predictions that are likely to be wrong. Correct and incorrect CIFAR-10 predictions are separated using the ground-truth labels. Normalized predictive entropy lies in [0,1]; larger values indicate a more diffuse class distribution. Prediction error is the positive class. AUROC measures ranking across thresholds, and AUPR summarizes precision-recall performance for the error class.</w:t>
+      </w:r>
+    </w:p>
+    <w:p>
+      <w:pPr>
+        <w:pStyle w:val="Heading2"/>
+      </w:pPr>
+      <w:r>
+        <w:t>5.8 OOD evaluation</w:t>
+      </w:r>
+    </w:p>
+    <w:p>
+      <w:r>
+        <w:t>The OOD experiment asks whether the models assign greater uncertainty to inputs outside the CIFAR-10 distribution. CIFAR-10 is labelled ID, SVHN is labelled OOD, and OOD is the positive class. Normalized predictive entropy is the common score for both models, which avoids comparing method-specific scales. DAEDL's secondary score, 1-s(x), is evaluated separately as density-derived uncertainty.</w:t>
+      </w:r>
+    </w:p>
+    <w:p>
+      <w:pPr>
+        <w:pStyle w:val="Heading2"/>
+      </w:pPr>
+      <w:r>
+        <w:t>5.9 Numerical stability and device policy</w:t>
+      </w:r>
+    </w:p>
+    <w:p>
+      <w:r>
+        <w:t>Training used MPS, while loaded-checkpoint evaluation and feature extraction used CPU for both models. DAEDL covariance and density calculations used CPU float64, adaptive diagonal jitter, and Cholesky checks. Evaluation also checked finite outputs, probability sums, positive concentrations, density bounds, and score orientation before aggregation.</w:t>
+      </w:r>
+    </w:p>
+    <w:p>
+      <w:pPr>
+        <w:pStyle w:val="Heading2"/>
+      </w:pPr>
+      <w:r>
+        <w:t>5.10 Experiment questions</w:t>
+      </w:r>
+    </w:p>
+    <w:p>
+      <w:pPr>
+        <w:pStyle w:val="Caption"/>
+        <w:keepNext/>
+        <w:jc w:val="center"/>
+      </w:pPr>
+      <w:r>
+        <w:rPr>
+          <w:b/>
+        </w:rPr>
+        <w:t xml:space="preserve">Table 2. </w:t>
+      </w:r>
+      <w:r>
+        <w:t>Evaluation questions and reported metrics.</w:t>
+      </w:r>
+    </w:p>
+    <w:tbl>
+      <w:tblPr>
+        <w:tblW w:type="auto" w:w="0"/>
+        <w:jc w:val="center"/>
+        <w:tblLayout w:type="fixed"/>
+        <w:tblLook w:firstColumn="1" w:firstRow="1" w:lastColumn="0" w:lastRow="0" w:noHBand="0" w:noVBand="1" w:val="04A0"/>
+      </w:tblPr>
+      <w:tblGrid>
+        <w:gridCol w:w="3312"/>
+        <w:gridCol w:w="3312"/>
+        <w:gridCol w:w="3312"/>
+      </w:tblGrid>
+      <w:tr>
+        <w:trPr>
+          <w:tblHeader w:val="true"/>
+        </w:trPr>
+        <w:tc>
+          <w:tcPr>
+            <w:tcW w:type="dxa" w:w="1944"/>
+            <w:vAlign w:val="center"/>
+            <w:shd w:fill="17365D"/>
+            <w:tcBorders>
+              <w:top w:val="single" w:sz="6" w:color="D9D9D9"/>
+              <w:left w:val="single" w:sz="6" w:color="D9D9D9"/>
+              <w:bottom w:val="single" w:sz="6" w:color="D9D9D9"/>
+              <w:right w:val="single" w:sz="6" w:color="D9D9D9"/>
+              <w:insideH w:val="single" w:sz="6" w:color="D9D9D9"/>
+              <w:insideV w:val="single" w:sz="6" w:color="D9D9D9"/>
+            </w:tcBorders>
+            <w:tcMar>
+              <w:top w:w="90" w:type="dxa"/>
+              <w:start w:w="100" w:type="dxa"/>
+              <w:bottom w:w="90" w:type="dxa"/>
+              <w:end w:w="100" w:type="dxa"/>
+            </w:tcMar>
+          </w:tcPr>
+          <w:p>
+            <w:pPr>
+              <w:jc w:val="center"/>
+            </w:pPr>
+            <w:r>
+              <w:rPr>
+                <w:b/>
+                <w:color w:val="FFFFFF"/>
+                <w:sz w:val="18"/>
+              </w:rPr>
+              <w:t>Experiment</w:t>
+            </w:r>
+          </w:p>
+        </w:tc>
+        <w:tc>
+          <w:tcPr>
+            <w:tcW w:type="dxa" w:w="5400"/>
+            <w:vAlign w:val="center"/>
+            <w:shd w:fill="17365D"/>
+            <w:tcBorders>
+              <w:top w:val="single" w:sz="6" w:color="D9D9D9"/>
+              <w:left w:val="single" w:sz="6" w:color="D9D9D9"/>
+              <w:bottom w:val="single" w:sz="6" w:color="D9D9D9"/>
+              <w:right w:val="single" w:sz="6" w:color="D9D9D9"/>
+              <w:insideH w:val="single" w:sz="6" w:color="D9D9D9"/>
+              <w:insideV w:val="single" w:sz="6" w:color="D9D9D9"/>
+            </w:tcBorders>
+            <w:tcMar>
+              <w:top w:w="90" w:type="dxa"/>
+              <w:start w:w="100" w:type="dxa"/>
+              <w:bottom w:w="90" w:type="dxa"/>
+              <w:end w:w="100" w:type="dxa"/>
+            </w:tcMar>
+          </w:tcPr>
+          <w:p>
+            <w:pPr>
+              <w:jc w:val="center"/>
+            </w:pPr>
+            <w:r>
+              <w:rPr>
+                <w:b/>
+                <w:color w:val="FFFFFF"/>
+                <w:sz w:val="18"/>
+              </w:rPr>
+              <w:t>Main question</w:t>
+            </w:r>
+          </w:p>
+        </w:tc>
+        <w:tc>
+          <w:tcPr>
+            <w:tcW w:type="dxa" w:w="2088"/>
+            <w:vAlign w:val="center"/>
+            <w:shd w:fill="17365D"/>
+            <w:tcBorders>
+              <w:top w:val="single" w:sz="6" w:color="D9D9D9"/>
+              <w:left w:val="single" w:sz="6" w:color="D9D9D9"/>
+              <w:bottom w:val="single" w:sz="6" w:color="D9D9D9"/>
+              <w:right w:val="single" w:sz="6" w:color="D9D9D9"/>
+              <w:insideH w:val="single" w:sz="6" w:color="D9D9D9"/>
+              <w:insideV w:val="single" w:sz="6" w:color="D9D9D9"/>
+            </w:tcBorders>
+            <w:tcMar>
+              <w:top w:w="90" w:type="dxa"/>
+              <w:start w:w="100" w:type="dxa"/>
+              <w:bottom w:w="90" w:type="dxa"/>
+              <w:end w:w="100" w:type="dxa"/>
+            </w:tcMar>
+          </w:tcPr>
+          <w:p>
+            <w:pPr>
+              <w:jc w:val="center"/>
+            </w:pPr>
+            <w:r>
+              <w:rPr>
+                <w:b/>
+                <w:color w:val="FFFFFF"/>
+                <w:sz w:val="18"/>
+              </w:rPr>
+              <w:t>Metrics</w:t>
+            </w:r>
+          </w:p>
+        </w:tc>
+      </w:tr>
+      <w:tr>
+        <w:tc>
+          <w:tcPr>
+            <w:tcW w:type="dxa" w:w="1944"/>
+            <w:vAlign w:val="center"/>
+            <w:tcBorders>
+              <w:top w:val="single" w:sz="6" w:color="D9D9D9"/>
+              <w:left w:val="single" w:sz="6" w:color="D9D9D9"/>
+              <w:bottom w:val="single" w:sz="6" w:color="D9D9D9"/>
+              <w:right w:val="single" w:sz="6" w:color="D9D9D9"/>
+              <w:insideH w:val="single" w:sz="6" w:color="D9D9D9"/>
+              <w:insideV w:val="single" w:sz="6" w:color="D9D9D9"/>
+            </w:tcBorders>
+            <w:tcMar>
+              <w:top w:w="90" w:type="dxa"/>
+              <w:start w:w="100" w:type="dxa"/>
+              <w:bottom w:w="90" w:type="dxa"/>
+              <w:end w:w="100" w:type="dxa"/>
+            </w:tcMar>
+          </w:tcPr>
+          <w:p>
+            <w:pPr>
+              <w:jc w:val="left"/>
+            </w:pPr>
+            <w:r>
+              <w:rPr>
+                <w:sz w:val="18"/>
+              </w:rPr>
+              <w:t>Classification</w:t>
+            </w:r>
+          </w:p>
+        </w:tc>
+        <w:tc>
+          <w:tcPr>
+            <w:tcW w:type="dxa" w:w="5400"/>
+            <w:vAlign w:val="center"/>
+            <w:tcBorders>
+              <w:top w:val="single" w:sz="6" w:color="D9D9D9"/>
+              <w:left w:val="single" w:sz="6" w:color="D9D9D9"/>
+              <w:bottom w:val="single" w:sz="6" w:color="D9D9D9"/>
+              <w:right w:val="single" w:sz="6" w:color="D9D9D9"/>
+              <w:insideH w:val="single" w:sz="6" w:color="D9D9D9"/>
+              <w:insideV w:val="single" w:sz="6" w:color="D9D9D9"/>
+            </w:tcBorders>
+            <w:tcMar>
+              <w:top w:w="90" w:type="dxa"/>
+              <w:start w:w="100" w:type="dxa"/>
+              <w:bottom w:w="90" w:type="dxa"/>
+              <w:end w:w="100" w:type="dxa"/>
+            </w:tcMar>
+          </w:tcPr>
+          <w:p>
+            <w:pPr>
+              <w:jc w:val="center"/>
+            </w:pPr>
+            <w:r>
+              <w:rPr>
+                <w:sz w:val="18"/>
+              </w:rPr>
+              <w:t>How accurately does the model classify CIFAR-10?</w:t>
+            </w:r>
+          </w:p>
+        </w:tc>
+        <w:tc>
+          <w:tcPr>
+            <w:tcW w:type="dxa" w:w="2088"/>
+            <w:vAlign w:val="center"/>
+            <w:tcBorders>
+              <w:top w:val="single" w:sz="6" w:color="D9D9D9"/>
+              <w:left w:val="single" w:sz="6" w:color="D9D9D9"/>
+              <w:bottom w:val="single" w:sz="6" w:color="D9D9D9"/>
+              <w:right w:val="single" w:sz="6" w:color="D9D9D9"/>
+              <w:insideH w:val="single" w:sz="6" w:color="D9D9D9"/>
+              <w:insideV w:val="single" w:sz="6" w:color="D9D9D9"/>
+            </w:tcBorders>
+            <w:tcMar>
+              <w:top w:w="90" w:type="dxa"/>
+              <w:start w:w="100" w:type="dxa"/>
+              <w:bottom w:w="90" w:type="dxa"/>
+              <w:end w:w="100" w:type="dxa"/>
+            </w:tcMar>
+          </w:tcPr>
+          <w:p>
+            <w:pPr>
+              <w:jc w:val="center"/>
+            </w:pPr>
+            <w:r>
+              <w:rPr>
+                <w:sz w:val="18"/>
+              </w:rPr>
+              <w:t>Accuracy; Macro F1</w:t>
+            </w:r>
+          </w:p>
+        </w:tc>
+      </w:tr>
+      <w:tr>
+        <w:tc>
+          <w:tcPr>
+            <w:tcW w:type="dxa" w:w="1944"/>
+            <w:vAlign w:val="center"/>
+            <w:tcBorders>
+              <w:top w:val="single" w:sz="6" w:color="D9D9D9"/>
+              <w:left w:val="single" w:sz="6" w:color="D9D9D9"/>
+              <w:bottom w:val="single" w:sz="6" w:color="D9D9D9"/>
+              <w:right w:val="single" w:sz="6" w:color="D9D9D9"/>
+              <w:insideH w:val="single" w:sz="6" w:color="D9D9D9"/>
+              <w:insideV w:val="single" w:sz="6" w:color="D9D9D9"/>
+            </w:tcBorders>
+            <w:tcMar>
+              <w:top w:w="90" w:type="dxa"/>
+              <w:start w:w="100" w:type="dxa"/>
+              <w:bottom w:w="90" w:type="dxa"/>
+              <w:end w:w="100" w:type="dxa"/>
+            </w:tcMar>
+            <w:shd w:fill="F2F6FA"/>
+          </w:tcPr>
+          <w:p>
+            <w:pPr>
+              <w:jc w:val="left"/>
+            </w:pPr>
+            <w:r>
+              <w:rPr>
+                <w:sz w:val="18"/>
+              </w:rPr>
+              <w:t>Calibration</w:t>
+            </w:r>
+          </w:p>
+        </w:tc>
+        <w:tc>
+          <w:tcPr>
+            <w:tcW w:type="dxa" w:w="5400"/>
+            <w:vAlign w:val="center"/>
+            <w:tcBorders>
+              <w:top w:val="single" w:sz="6" w:color="D9D9D9"/>
+              <w:left w:val="single" w:sz="6" w:color="D9D9D9"/>
+              <w:bottom w:val="single" w:sz="6" w:color="D9D9D9"/>
+              <w:right w:val="single" w:sz="6" w:color="D9D9D9"/>
+              <w:insideH w:val="single" w:sz="6" w:color="D9D9D9"/>
+              <w:insideV w:val="single" w:sz="6" w:color="D9D9D9"/>
+            </w:tcBorders>
+            <w:tcMar>
+              <w:top w:w="90" w:type="dxa"/>
+              <w:start w:w="100" w:type="dxa"/>
+              <w:bottom w:w="90" w:type="dxa"/>
+              <w:end w:w="100" w:type="dxa"/>
+            </w:tcMar>
+            <w:shd w:fill="F2F6FA"/>
+          </w:tcPr>
+          <w:p>
+            <w:pPr>
+              <w:jc w:val="center"/>
+            </w:pPr>
+            <w:r>
+              <w:rPr>
+                <w:sz w:val="18"/>
+              </w:rPr>
+              <w:t>Do predicted probabilities match empirical correctness?</w:t>
+            </w:r>
+          </w:p>
+        </w:tc>
+        <w:tc>
+          <w:tcPr>
+            <w:tcW w:type="dxa" w:w="2088"/>
+            <w:vAlign w:val="center"/>
+            <w:tcBorders>
+              <w:top w:val="single" w:sz="6" w:color="D9D9D9"/>
+              <w:left w:val="single" w:sz="6" w:color="D9D9D9"/>
+              <w:bottom w:val="single" w:sz="6" w:color="D9D9D9"/>
+              <w:right w:val="single" w:sz="6" w:color="D9D9D9"/>
+              <w:insideH w:val="single" w:sz="6" w:color="D9D9D9"/>
+              <w:insideV w:val="single" w:sz="6" w:color="D9D9D9"/>
+            </w:tcBorders>
+            <w:tcMar>
+              <w:top w:w="90" w:type="dxa"/>
+              <w:start w:w="100" w:type="dxa"/>
+              <w:bottom w:w="90" w:type="dxa"/>
+              <w:end w:w="100" w:type="dxa"/>
+            </w:tcMar>
+            <w:shd w:fill="F2F6FA"/>
+          </w:tcPr>
+          <w:p>
+            <w:pPr>
+              <w:jc w:val="center"/>
+            </w:pPr>
+            <w:r>
+              <w:rPr>
+                <w:sz w:val="18"/>
+              </w:rPr>
+              <w:t>NLL; ECE; Brier</w:t>
+            </w:r>
+          </w:p>
+        </w:tc>
+      </w:tr>
+      <w:tr>
+        <w:tc>
+          <w:tcPr>
+            <w:tcW w:type="dxa" w:w="1944"/>
+            <w:vAlign w:val="center"/>
+            <w:tcBorders>
+              <w:top w:val="single" w:sz="6" w:color="D9D9D9"/>
+              <w:left w:val="single" w:sz="6" w:color="D9D9D9"/>
+              <w:bottom w:val="single" w:sz="6" w:color="D9D9D9"/>
+              <w:right w:val="single" w:sz="6" w:color="D9D9D9"/>
+              <w:insideH w:val="single" w:sz="6" w:color="D9D9D9"/>
+              <w:insideV w:val="single" w:sz="6" w:color="D9D9D9"/>
+            </w:tcBorders>
+            <w:tcMar>
+              <w:top w:w="90" w:type="dxa"/>
+              <w:start w:w="100" w:type="dxa"/>
+              <w:bottom w:w="90" w:type="dxa"/>
+              <w:end w:w="100" w:type="dxa"/>
+            </w:tcMar>
+          </w:tcPr>
+          <w:p>
+            <w:pPr>
+              <w:jc w:val="left"/>
+            </w:pPr>
+            <w:r>
+              <w:rPr>
+                <w:sz w:val="18"/>
+              </w:rPr>
+              <w:t>Error uncertainty</w:t>
+            </w:r>
+          </w:p>
+        </w:tc>
+        <w:tc>
+          <w:tcPr>
+            <w:tcW w:type="dxa" w:w="5400"/>
+            <w:vAlign w:val="center"/>
+            <w:tcBorders>
+              <w:top w:val="single" w:sz="6" w:color="D9D9D9"/>
+              <w:left w:val="single" w:sz="6" w:color="D9D9D9"/>
+              <w:bottom w:val="single" w:sz="6" w:color="D9D9D9"/>
+              <w:right w:val="single" w:sz="6" w:color="D9D9D9"/>
+              <w:insideH w:val="single" w:sz="6" w:color="D9D9D9"/>
+              <w:insideV w:val="single" w:sz="6" w:color="D9D9D9"/>
+            </w:tcBorders>
+            <w:tcMar>
+              <w:top w:w="90" w:type="dxa"/>
+              <w:start w:w="100" w:type="dxa"/>
+              <w:bottom w:w="90" w:type="dxa"/>
+              <w:end w:w="100" w:type="dxa"/>
+            </w:tcMar>
+          </w:tcPr>
+          <w:p>
+            <w:pPr>
+              <w:jc w:val="center"/>
+            </w:pPr>
+            <w:r>
+              <w:rPr>
+                <w:sz w:val="18"/>
+              </w:rPr>
+              <w:t>Can uncertainty identify incorrect predictions?</w:t>
+            </w:r>
+          </w:p>
+        </w:tc>
+        <w:tc>
+          <w:tcPr>
+            <w:tcW w:type="dxa" w:w="2088"/>
+            <w:vAlign w:val="center"/>
+            <w:tcBorders>
+              <w:top w:val="single" w:sz="6" w:color="D9D9D9"/>
+              <w:left w:val="single" w:sz="6" w:color="D9D9D9"/>
+              <w:bottom w:val="single" w:sz="6" w:color="D9D9D9"/>
+              <w:right w:val="single" w:sz="6" w:color="D9D9D9"/>
+              <w:insideH w:val="single" w:sz="6" w:color="D9D9D9"/>
+              <w:insideV w:val="single" w:sz="6" w:color="D9D9D9"/>
+            </w:tcBorders>
+            <w:tcMar>
+              <w:top w:w="90" w:type="dxa"/>
+              <w:start w:w="100" w:type="dxa"/>
+              <w:bottom w:w="90" w:type="dxa"/>
+              <w:end w:w="100" w:type="dxa"/>
+            </w:tcMar>
+          </w:tcPr>
+          <w:p>
+            <w:pPr>
+              <w:jc w:val="center"/>
+            </w:pPr>
+            <w:r>
+              <w:rPr>
+                <w:sz w:val="18"/>
+              </w:rPr>
+              <w:t>Entropy; AUROC; AUPR</w:t>
+            </w:r>
+          </w:p>
+        </w:tc>
+      </w:tr>
+      <w:tr>
+        <w:tc>
+          <w:tcPr>
+            <w:tcW w:type="dxa" w:w="1944"/>
+            <w:vAlign w:val="center"/>
+            <w:tcBorders>
+              <w:top w:val="single" w:sz="6" w:color="D9D9D9"/>
+              <w:left w:val="single" w:sz="6" w:color="D9D9D9"/>
+              <w:bottom w:val="single" w:sz="6" w:color="D9D9D9"/>
+              <w:right w:val="single" w:sz="6" w:color="D9D9D9"/>
+              <w:insideH w:val="single" w:sz="6" w:color="D9D9D9"/>
+              <w:insideV w:val="single" w:sz="6" w:color="D9D9D9"/>
+            </w:tcBorders>
+            <w:tcMar>
+              <w:top w:w="90" w:type="dxa"/>
+              <w:start w:w="100" w:type="dxa"/>
+              <w:bottom w:w="90" w:type="dxa"/>
+              <w:end w:w="100" w:type="dxa"/>
+            </w:tcMar>
+            <w:shd w:fill="F2F6FA"/>
+          </w:tcPr>
+          <w:p>
+            <w:pPr>
+              <w:jc w:val="left"/>
+            </w:pPr>
+            <w:r>
+              <w:rPr>
+                <w:sz w:val="18"/>
+              </w:rPr>
+              <w:t>OOD uncertainty</w:t>
+            </w:r>
+          </w:p>
+        </w:tc>
+        <w:tc>
+          <w:tcPr>
+            <w:tcW w:type="dxa" w:w="5400"/>
+            <w:vAlign w:val="center"/>
+            <w:tcBorders>
+              <w:top w:val="single" w:sz="6" w:color="D9D9D9"/>
+              <w:left w:val="single" w:sz="6" w:color="D9D9D9"/>
+              <w:bottom w:val="single" w:sz="6" w:color="D9D9D9"/>
+              <w:right w:val="single" w:sz="6" w:color="D9D9D9"/>
+              <w:insideH w:val="single" w:sz="6" w:color="D9D9D9"/>
+              <w:insideV w:val="single" w:sz="6" w:color="D9D9D9"/>
+            </w:tcBorders>
+            <w:tcMar>
+              <w:top w:w="90" w:type="dxa"/>
+              <w:start w:w="100" w:type="dxa"/>
+              <w:bottom w:w="90" w:type="dxa"/>
+              <w:end w:w="100" w:type="dxa"/>
+            </w:tcMar>
+            <w:shd w:fill="F2F6FA"/>
+          </w:tcPr>
+          <w:p>
+            <w:pPr>
+              <w:jc w:val="center"/>
+            </w:pPr>
+            <w:r>
+              <w:rPr>
+                <w:sz w:val="18"/>
+              </w:rPr>
+              <w:t>Can uncertainty distinguish CIFAR-10 from SVHN?</w:t>
+            </w:r>
+          </w:p>
+        </w:tc>
+        <w:tc>
+          <w:tcPr>
+            <w:tcW w:type="dxa" w:w="2088"/>
+            <w:vAlign w:val="center"/>
+            <w:tcBorders>
+              <w:top w:val="single" w:sz="6" w:color="D9D9D9"/>
+              <w:left w:val="single" w:sz="6" w:color="D9D9D9"/>
+              <w:bottom w:val="single" w:sz="6" w:color="D9D9D9"/>
+              <w:right w:val="single" w:sz="6" w:color="D9D9D9"/>
+              <w:insideH w:val="single" w:sz="6" w:color="D9D9D9"/>
+              <w:insideV w:val="single" w:sz="6" w:color="D9D9D9"/>
+            </w:tcBorders>
+            <w:tcMar>
+              <w:top w:w="90" w:type="dxa"/>
+              <w:start w:w="100" w:type="dxa"/>
+              <w:bottom w:w="90" w:type="dxa"/>
+              <w:end w:w="100" w:type="dxa"/>
+            </w:tcMar>
+            <w:shd w:fill="F2F6FA"/>
+          </w:tcPr>
+          <w:p>
+            <w:pPr>
+              <w:jc w:val="center"/>
+            </w:pPr>
+            <w:r>
+              <w:rPr>
+                <w:sz w:val="18"/>
+              </w:rPr>
+              <w:t>Entropy; AUROC; AUPR</w:t>
+            </w:r>
+          </w:p>
+        </w:tc>
+      </w:tr>
+    </w:tbl>
     <w:p>
       <w:r>
         <w:br w:type="page"/>
@@ -1396,7 +2117,7 @@
         <w:rPr>
           <w:b/>
         </w:rPr>
-        <w:t xml:space="preserve">Table 2. </w:t>
+        <w:t xml:space="preserve">Table 3. </w:t>
       </w:r>
       <w:r>
         <w:t>Clean CIFAR-10 classification and calibration. Values are mean ± sample SD across three training seeds.</w:t>
@@ -2271,7 +2992,7 @@
     </w:p>
     <w:p>
       <w:r>
-        <w:t>The seed-3024 reliability diagram illustrates why a single calibration summary needs context. DAEDL tracks the ideal diagonal more closely in several high-confidence bins, consistent with its lower ECE. The plot is illustrative rather than aggregate: bins with fewer than 50 test examples are suppressed for readability, but ECE is still calculated from all 15 equal-width bins.</w:t>
+        <w:t>The seed-3024 reliability diagram illustrates why a single calibration summary needs context. DAEDL tracks the ideal diagonal more closely in several high-confidence bins, consistent with its lower ECE. The plot shows seed 3024 as an example. Bins with fewer than 50 test examples are suppressed for readability, while ECE is calculated from all 15 equal-width bins.</w:t>
       </w:r>
     </w:p>
     <w:p>
@@ -2345,7 +3066,7 @@
     </w:p>
     <w:p>
       <w:r>
-        <w:t>DAEDL's larger absolute entropy does not automatically mean better error detection. AUROC evaluates how well uncertainty ranks incorrect above correct predictions. Softmax had a small consistent AUROC advantage at every seed, while AUPR changed paired direction. The most defensible conclusion is that both methods detected errors well and Softmax ranked them slightly better under AUROC.</w:t>
+        <w:t>DAEDL produced larger entropy values. AUROC instead measures how well uncertainty ranks incorrect predictions above correct ones. Both models separated incorrect from correct predictions well, with Softmax achieving a slightly higher AUROC in every seed. AUPR changed paired direction.</w:t>
       </w:r>
     </w:p>
     <w:p>
@@ -2353,7 +3074,7 @@
         <w:pStyle w:val="Heading2"/>
       </w:pPr>
       <w:r>
-        <w:t>6.4 SVHN out of distribution uncertainty</w:t>
+        <w:t>6.4 SVHN Out-of-Distribution Uncertainty</w:t>
       </w:r>
     </w:p>
     <w:p>
@@ -2366,7 +3087,7 @@
         <w:rPr>
           <w:b/>
         </w:rPr>
-        <w:t xml:space="preserve">Table 3. </w:t>
+        <w:t xml:space="preserve">Table 4. </w:t>
       </w:r>
       <w:r>
         <w:t>Error and SVHN OOD detection using normalized predictive entropy. Values are mean ± sample SD across three seeds.</w:t>
@@ -2880,12 +3601,12 @@
     </w:tbl>
     <w:p>
       <w:r>
-        <w:t>DAEDL consistently assigned greater entropy to SVHN than to CIFAR-10: its ID and OOD mean entropies were 0.2052 ± 0.0016 and 0.6840 ± 0.0657. Softmax showed the same direction at a lower absolute scale. However, method ranking was seed dependent. Softmax had higher OOD AUROC at seeds 3024 and 3026, while DAEDL was higher at seed 3025. The aggregate values therefore do not establish a stable OOD winner.</w:t>
+        <w:t>DAEDL consistently assigned greater entropy to SVHN than to CIFAR-10: its ID and OOD mean entropies were 0.2052 ± 0.0016 and 0.6840 ± 0.0657. Softmax showed the same direction at a lower absolute scale. Softmax had higher OOD AUROC at seeds 3024 and 3026; DAEDL was higher at seed 3025. Neither method was consistently better across the three seeds.</w:t>
       </w:r>
     </w:p>
     <w:p>
       <w:r>
-        <w:t>DAEDL's secondary density-only uncertainty also lacked a consistent advantage over its entropy score. Density AUROC was 0.8641, 0.8420, and 0.8498 at seeds 3024–3026. It exceeded DAEDL entropy only at seed 3024. This negative result is retained because the evaluation protocol was frozen before the replications.</w:t>
+        <w:t>DAEDL's secondary density-only uncertainty had AUROC values of 0.8641, 0.8420, and 0.8498 at seeds 3024–3026. The density score exceeded DAEDL entropy only at seed 3024, so the improvement was not consistent across seeds.</w:t>
       </w:r>
     </w:p>
     <w:p>
@@ -2962,7 +3683,7 @@
     </w:p>
     <w:p>
       <w:r>
-        <w:t>DAEDL added a structured probabilistic representation without improving clean classification in this setup. This is not an implementation failure: every run completed, checkpoint validation passed, and the classification differences repeated across seeds. The result shows that a dedicated uncertainty mechanism does not guarantee a better classifier.</w:t>
+        <w:t>Softmax achieved higher clean classification accuracy in all three seeds. In this setup, DAEDL's uncertainty modelling did not improve classification performance.</w:t>
       </w:r>
     </w:p>
     <w:p>
@@ -2970,12 +3691,12 @@
         <w:pStyle w:val="Heading2"/>
       </w:pPr>
       <w:r>
-        <w:t>7.2 Calibration is multi dimensional</w:t>
+        <w:t>7.2 Calibration is Multidimensional</w:t>
       </w:r>
     </w:p>
     <w:p>
       <w:r>
-        <w:t>DAEDL's ECE advantage and Softmax's NLL/Brier advantages coexist because the metrics measure different properties. Reporting only ECE would make DAEDL appear generally better calibrated, while reporting only NLL would hide its more favorable binned confidence-frequency agreement. The accurate statement is narrower: DAEDL improved ECE, while Softmax remained stronger under the two proper scoring rules.</w:t>
+        <w:t>DAEDL consistently achieved lower ECE, whereas Softmax achieved lower NLL and Brier scores. These metrics can disagree because ECE measures binned confidence-frequency agreement, while NLL and Brier score evaluate the full probability distribution and penalize probability errors differently.</w:t>
       </w:r>
     </w:p>
     <w:p>
@@ -2988,7 +3709,7 @@
     </w:p>
     <w:p>
       <w:r>
-        <w:t>DAEDL produced higher entropy for correct, incorrect, ID, and OOD samples. That wider numerical range made mistakes and SVHN inputs visibly uncertain, but it did not reliably improve discrimination AUROC. The practical question is whether a score ranks risky inputs consistently, not simply whether its numeric value is larger.</w:t>
+        <w:t>DAEDL produced higher entropy for correct, incorrect, ID, and OOD samples. That wider numerical range made mistakes and SVHN inputs visibly uncertain. AUROC, however, depends on how consistently the score ranks risky inputs, and DAEDL did not improve that ranking consistently.</w:t>
       </w:r>
     </w:p>
     <w:p>
@@ -3001,7 +3722,7 @@
     </w:p>
     <w:p>
       <w:r>
-        <w:t>Multiple seeds materially changed the OOD interpretation. Seed 3024 alone suggested a clear Softmax advantage; seed 3025 reversed the ranking. The three-seed aggregate favors Softmax numerically, but the change in direction prevents a stable superiority claim. No significance test was added because three runs support descriptive consistency, not a persuasive estimate of a sampling distribution.</w:t>
+        <w:t>Multiple seeds changed the OOD interpretation. Seed 3024 favored Softmax, seed 3025 favored DAEDL, and seed 3026 favored Softmax. The three-seed mean favored Softmax, but the ordering was not consistent. With only three runs, the comparison is reported descriptively without a hypothesis test.</w:t>
       </w:r>
     </w:p>
     <w:p>
@@ -3014,7 +3735,7 @@
     </w:p>
     <w:p>
       <w:r>
-        <w:t>The original DAEDL work used a different architecture and larger training setup [1]. This project used a compact ResNet-18, 128-dimensional embeddings, 30 epochs, and laptop hardware so that a matched three-seed comparison was feasible. It is an implementation and evaluation of the method's central ideas, not an exact reproduction of the paper's headline results.</w:t>
+        <w:t>The original DAEDL work used a different architecture and larger training setup [1]. This project used a compact ResNet-18, 128-dimensional embeddings, 30 epochs, and laptop hardware so that a matched three-seed comparison was feasible. It evaluates the method's central ideas at assignment scale; the results are specific to this setup.</w:t>
       </w:r>
     </w:p>
     <w:p>
@@ -3027,17 +3748,17 @@
     </w:p>
     <w:p>
       <w:r>
-        <w:t>The evaluation uses one in-distribution dataset, one OOD dataset, and three seeds. It does not cover every corruption, architecture, or evidential baseline. No exhaustive hyperparameter search was performed, and settings were frozen before replications to avoid tuning to seed 3024. MPS and CPU adaptations differ from the authors' CUDA-oriented environment. The DAEDL feature space was rank deficient even though covariance stabilization remained finite.</w:t>
+        <w:t>The evaluation uses one in-distribution dataset, one OOD dataset, and three seeds. No exhaustive hyperparameter search was performed, and the study did not cover other architectures or evidential baselines. MPS and CPU adaptations differ from the authors' CUDA-oriented environment. The DAEDL feature space was rank deficient even though covariance stabilization remained finite.</w:t>
       </w:r>
     </w:p>
     <w:p>
       <w:r>
-        <w:t>Global centered embedding rank was 93, 99, and 101 out of 128, while constant dimensions were 35, 29, and 27. Per-class covariance ranks spanned 76–95. Jitter remained around 1e-8 to 1e-7 and every non-finite fraction was zero, so the density results are usable but the reduced-rank representation should remain visible as a limitation.</w:t>
+        <w:t>Global centered embedding rank was 93, 99, and 101 out of 128, while constant dimensions were 35, 29, and 27. Per-class covariance ranks spanned 76–95. Jitter remained around 1e-8 to 1e-7 and every non-finite fraction was zero. Density fitting remained numerically stable, although the reduced embedding rank is a limitation of this implementation.</w:t>
       </w:r>
     </w:p>
     <w:p>
       <w:r>
-        <w:t>No corruption experiment was added after the three-seed study. This was a deliberate stopping decision: the core assignment questions were already answered, and adding another analysis after reviewing outcomes would have expanded the scope without resolving the seed-sensitive OOD ranking.</w:t>
+        <w:t>Corruption experiments were outside the final scope of this assignment.</w:t>
       </w:r>
     </w:p>
     <w:p>
@@ -3065,22 +3786,22 @@
     </w:p>
     <w:p>
       <w:r>
-        <w:t>I also expected a method designed for uncertainty to outperform Softmax clearly on OOD detection. The seed results showed that this expectation was too simple. Softmax was better at seed 3024, DAEDL was better at seed 3025, and Softmax was better again at seed 3026. Had I stopped after the first run, I would have described the OOD comparison too confidently. Repeating the experiment did not merely make the result look more reliable; it changed the conclusion I was allowed to make.</w:t>
+        <w:t>I also expected a method designed for uncertainty to outperform Softmax clearly on OOD detection. The result at seed 3024 initially pointed in the other direction. After running the other two seeds, my interpretation changed: DAEDL was better at seed 3025, while Softmax was better again at seed 3026. The full result was mixed across seeds.</w:t>
       </w:r>
     </w:p>
     <w:p>
       <w:r>
-        <w:t>The project also taught me that a larger uncertainty value is not automatically more useful. DAEDL produced much greater entropy on incorrect and SVHN inputs, but Softmax had slightly better error AUROC and a higher mean OOD AUROC. The separation between groups matters more than the absolute scale. This distinction is especially important when comparing models whose uncertainty scores arise from different parameterizations.</w:t>
+        <w:t>The project also taught me to separate uncertainty magnitude from ranking quality. DAEDL produced much greater entropy on incorrect and SVHN inputs. Softmax still had slightly better error AUROC and a higher mean OOD AUROC. The separation between groups matters more than the absolute scale when models use different uncertainty parameterizations.</w:t>
       </w:r>
     </w:p>
     <w:p>
       <w:r>
-        <w:t>Using Codex did not remove the need for validation. Codex wrote the code and ran the experiments, but the workflow still needed tests for formulas and metrics, matched baselines, fixed checkpoint rules, checks for OOD score direction, probability normalization, and independent recomputation from saved predictions. The most useful AI behavior was not rapid code generation alone. It was the ability to inspect failures, record what changed, and preserve negative or mixed results rather than tuning them away.</w:t>
+        <w:t>Codex wrote the code and ran the experiments. I found it especially useful for debugging and checking the experiment, not only for generating code. The workflow still needed tests for formulas and metrics, matched baselines, fixed checkpoint rules, checks for OOD score direction, probability normalization, and independent recomputation from saved predictions. It also helped me inspect failures, record changes, and keep mixed results in the final analysis.</w:t>
       </w:r>
     </w:p>
     <w:p>
       <w:r>
-        <w:t>Finally, I learned how theory meets hardware and numerical constraints. MPS could train the networks but not run float64 covariance calculations, and reloaded spectral-normalized checkpoints required CPU evaluation in this environment. Rank-deficient embedding covariances required adaptive diagonal loading and diagnostics. Reproducibility and numerical checks were therefore part of the experiment, not optional software details.</w:t>
+        <w:t>Finally, I learned how theory meets hardware and numerical constraints. MPS could train the networks but could not run float64 covariance calculations, and reloaded spectral-normalized checkpoints required CPU evaluation in this environment. Rank-deficient embedding covariances required adaptive diagonal loading and diagnostics. These hardware and numerical checks became part of the experimental workflow.</w:t>
       </w:r>
     </w:p>
     <w:p>
@@ -3093,8 +3814,32 @@
     </w:p>
     <w:p>
       <w:r>
-        <w:t>Codex successfully implemented DAEDL and compared it with a matched Softmax baseline across three CIFAR-10 seeds. DAEDL consistently reduced ECE, while Softmax remained stronger in accuracy, Macro F1, NLL, Brier score, and error-detection AUROC. Both methods assigned greater uncertainty to mistakes, and DAEDL assigned greater entropy to SVHN than CIFAR-10, but the OOD method ranking was not stable. The exercise demonstrated both the potential and limits of probabilistic uncertainty methods and showed why AI-generated implementation still requires careful experimental validation.</w:t>
+        <w:t>Codex implemented DAEDL and compared it with a matched Softmax baseline across three CIFAR-10 seeds. DAEDL consistently reduced ECE. Softmax achieved better accuracy, Macro F1, NLL, Brier score, and error-detection AUROC. Both methods assigned greater uncertainty to mistakes, and DAEDL assigned greater entropy to SVHN than CIFAR-10. The OOD ranking changed across seeds, and the added probabilistic structure did not improve every predictive or uncertainty measure.</w:t>
       </w:r>
+    </w:p>
+    <w:p>
+      <w:pPr>
+        <w:pStyle w:val="Heading1"/>
+      </w:pPr>
+      <w:r>
+        <w:t>11 Source Code</w:t>
+      </w:r>
+    </w:p>
+    <w:p>
+      <w:r>
+        <w:t>The complete source code, experiment scripts, configurations, and reproducibility files for this assignment are available at:</w:t>
+      </w:r>
+    </w:p>
+    <w:p>
+      <w:hyperlink r:id="rId22">
+        <w:r>
+          <w:rPr>
+            <w:color w:val="0563C1"/>
+            <w:u w:val="single"/>
+          </w:rPr>
+          <w:t>https://github.com/huangziqi-1/CISC3024-Assignment2-DAEDL</w:t>
+        </w:r>
+      </w:hyperlink>
     </w:p>
     <w:p>
       <w:r>
@@ -3106,7 +3851,7 @@
         <w:pStyle w:val="Heading1"/>
       </w:pPr>
       <w:r>
-        <w:t>References</w:t>
+        <w:t>12 References</w:t>
       </w:r>
     </w:p>
     <w:p>
@@ -3116,7 +3861,7 @@
       <w:r>
         <w:t xml:space="preserve">[1] Yoon, T., and Kim, H. (2024). “Uncertainty Estimation by Density Aware Evidential Deep Learning.” Proceedings of the 41st International Conference on Machine Learning, PMLR 235, 57217–57243. </w:t>
       </w:r>
-      <w:hyperlink r:id="rId22">
+      <w:hyperlink r:id="rId23">
         <w:r>
           <w:rPr>
             <w:color w:val="0563C1"/>
@@ -3133,7 +3878,7 @@
       <w:r>
         <w:t xml:space="preserve">[2] Sensoy, M., Kaplan, L., and Kandemir, M. (2018). “Evidential Deep Learning to Quantify Classification Uncertainty.” Advances in Neural Information Processing Systems 31. </w:t>
       </w:r>
-      <w:hyperlink r:id="rId23">
+      <w:hyperlink r:id="rId24">
         <w:r>
           <w:rPr>
             <w:color w:val="0563C1"/>
@@ -3150,7 +3895,7 @@
       <w:r>
         <w:t xml:space="preserve">[3] Guo, C., Pleiss, G., Sun, Y., and Weinberger, K. Q. (2017). “On Calibration of Modern Neural Networks.” Proceedings of the 34th International Conference on Machine Learning, PMLR 70, 1321–1330. </w:t>
       </w:r>
-      <w:hyperlink r:id="rId24">
+      <w:hyperlink r:id="rId25">
         <w:r>
           <w:rPr>
             <w:color w:val="0563C1"/>
@@ -3167,7 +3912,7 @@
       <w:r>
         <w:t xml:space="preserve">[4] Krizhevsky, A. (2009). Learning Multiple Layers of Features from Tiny Images. Technical report, University of Toronto. </w:t>
       </w:r>
-      <w:hyperlink r:id="rId25">
+      <w:hyperlink r:id="rId26">
         <w:r>
           <w:rPr>
             <w:color w:val="0563C1"/>
@@ -3184,13 +3929,13 @@
       <w:r>
         <w:t xml:space="preserve">[5] Netzer, Y., Wang, T., Coates, A., Bissacco, A., Wu, B., and Ng, A. Y. (2011). “Reading Digits in Natural Images with Unsupervised Feature Learning.” NIPS Workshop on Deep Learning and Unsupervised Feature Learning. </w:t>
       </w:r>
-      <w:hyperlink r:id="rId26">
+      <w:hyperlink r:id="rId27">
         <w:r>
           <w:rPr>
             <w:color w:val="0563C1"/>
             <w:u w:val="single"/>
           </w:rPr>
-          <w:t>https://ufldl.stanford.edu/housenumbers/nips2011_housenumbers.pdf</w:t>
+          <w:t>https://cs.stanford.edu/~twangcat/papers/nips2011_housenumbers.pdf</w:t>
         </w:r>
       </w:hyperlink>
     </w:p>
@@ -3201,7 +3946,7 @@
       <w:r>
         <w:t xml:space="preserve">[6] PyTorch Contributors. “MPS backend.” PyTorch documentation. </w:t>
       </w:r>
-      <w:hyperlink r:id="rId27">
+      <w:hyperlink r:id="rId28">
         <w:r>
           <w:rPr>
             <w:color w:val="0563C1"/>
@@ -3218,7 +3963,7 @@
       <w:r>
         <w:t xml:space="preserve">[7] Yoon, T., and Kim, H. “DAEDL official implementation.” GitHub. </w:t>
       </w:r>
-      <w:hyperlink r:id="rId28">
+      <w:hyperlink r:id="rId29">
         <w:r>
           <w:rPr>
             <w:color w:val="0563C1"/>

</xml_diff>